<commit_message>
Régénération du guide DOCX/PDF avec procédure Windows one-liner
Le guide met désormais en avant l'installation Windows en une seule
commande PowerShell (script install.ps1 hébergé sur le repo), validée
par CI sur Windows Server 2025, macOS et Linux.
</commit_message>
<xml_diff>
--- a/docs/Guide-Utilisation.docx
+++ b/docs/Guide-Utilisation.docx
@@ -841,22 +841,22 @@
       </w:r>
     </w:p>
     <w:bookmarkEnd w:id="13"/>
-    <w:bookmarkStart w:id="18" w:name="X56fa774c32233e71b090af5bfeda0cab446ab97"/>
+    <w:bookmarkStart w:id="18" w:name="installation-simple-recommandée"/>
     <w:p>
       <w:pPr>
         <w:pStyle w:val="Heading2"/>
       </w:pPr>
       <w:r>
-        <w:t xml:space="preserve">3. Installation simple en 2 commandes (recommandée)</w:t>
-      </w:r>
-    </w:p>
-    <w:bookmarkStart w:id="14" w:name="macos-linux"/>
+        <w:t xml:space="preserve">3. Installation simple (recommandée)</w:t>
+      </w:r>
+    </w:p>
+    <w:bookmarkStart w:id="14" w:name="windows-une-seule-commande"/>
     <w:p>
       <w:pPr>
         <w:pStyle w:val="Heading3"/>
       </w:pPr>
       <w:r>
-        <w:t xml:space="preserve">3.1 macOS / Linux</w:t>
+        <w:t xml:space="preserve">3.1 Windows — une seule commande</w:t>
       </w:r>
     </w:p>
     <w:p>
@@ -864,6 +864,241 @@
         <w:pStyle w:val="FirstParagraph"/>
       </w:pPr>
       <w:r>
+        <w:t xml:space="preserve">Ouvrez</w:t>
+      </w:r>
+      <w:r>
+        <w:t xml:space="preserve"> </w:t>
+      </w:r>
+      <w:r>
+        <w:rPr>
+          <w:b/>
+          <w:bCs/>
+        </w:rPr>
+        <w:t xml:space="preserve">PowerShell</w:t>
+      </w:r>
+      <w:r>
+        <w:t xml:space="preserve"> </w:t>
+      </w:r>
+      <w:r>
+        <w:t xml:space="preserve">(touche Windows, tapez « PowerShell », Entrée) et</w:t>
+      </w:r>
+      <w:r>
+        <w:t xml:space="preserve"> </w:t>
+      </w:r>
+      <w:r>
+        <w:rPr>
+          <w:b/>
+          <w:bCs/>
+        </w:rPr>
+        <w:t xml:space="preserve">collez la commande suivante</w:t>
+      </w:r>
+      <w:r>
+        <w:t xml:space="preserve">, puis appuyez sur Entrée :</w:t>
+      </w:r>
+    </w:p>
+    <w:p>
+      <w:pPr>
+        <w:pStyle w:val="SourceCode"/>
+      </w:pPr>
+      <w:r>
+        <w:rPr>
+          <w:rStyle w:val="VerbatimChar"/>
+        </w:rPr>
+        <w:t xml:space="preserve">iex (irm https://raw.githubusercontent.com/sbarhabazi/BiblioManager/main/install.ps1)</w:t>
+      </w:r>
+    </w:p>
+    <w:p>
+      <w:pPr>
+        <w:pStyle w:val="FirstParagraph"/>
+      </w:pPr>
+      <w:r>
+        <w:t xml:space="preserve">Cette commande exécute un petit script d’installation hébergé sur le dépôt GitHub officiel du projet. Le script effectue automatiquement :</w:t>
+      </w:r>
+    </w:p>
+    <w:p>
+      <w:pPr>
+        <w:pStyle w:val="Compact"/>
+        <w:numPr>
+          <w:ilvl w:val="0"/>
+          <w:numId w:val="1002"/>
+        </w:numPr>
+      </w:pPr>
+      <w:r>
+        <w:t xml:space="preserve">la vérification de Java 17 sur votre machine ;</w:t>
+      </w:r>
+    </w:p>
+    <w:p>
+      <w:pPr>
+        <w:pStyle w:val="Compact"/>
+        <w:numPr>
+          <w:ilvl w:val="0"/>
+          <w:numId w:val="1002"/>
+        </w:numPr>
+      </w:pPr>
+      <w:r>
+        <w:rPr>
+          <w:b/>
+          <w:bCs/>
+        </w:rPr>
+        <w:t xml:space="preserve">si Java est absent</w:t>
+      </w:r>
+      <w:r>
+        <w:t xml:space="preserve">, son installation via le gestionnaire</w:t>
+      </w:r>
+      <w:r>
+        <w:t xml:space="preserve"> </w:t>
+      </w:r>
+      <w:r>
+        <w:rPr>
+          <w:rStyle w:val="VerbatimChar"/>
+        </w:rPr>
+        <w:t xml:space="preserve">winget</w:t>
+      </w:r>
+      <w:r>
+        <w:t xml:space="preserve"> </w:t>
+      </w:r>
+      <w:r>
+        <w:t xml:space="preserve">(intégré à Windows 10 et 11) en utilisant la distribution officielle Eclipse Temurin ;</w:t>
+      </w:r>
+    </w:p>
+    <w:p>
+      <w:pPr>
+        <w:pStyle w:val="Compact"/>
+        <w:numPr>
+          <w:ilvl w:val="0"/>
+          <w:numId w:val="1002"/>
+        </w:numPr>
+      </w:pPr>
+      <w:r>
+        <w:t xml:space="preserve">le rechargement du</w:t>
+      </w:r>
+      <w:r>
+        <w:t xml:space="preserve"> </w:t>
+      </w:r>
+      <w:r>
+        <w:rPr>
+          <w:rStyle w:val="VerbatimChar"/>
+        </w:rPr>
+        <w:t xml:space="preserve">PATH</w:t>
+      </w:r>
+      <w:r>
+        <w:t xml:space="preserve"> </w:t>
+      </w:r>
+      <w:r>
+        <w:t xml:space="preserve">dans la session PowerShell courante (vous n’avez</w:t>
+      </w:r>
+      <w:r>
+        <w:t xml:space="preserve"> </w:t>
+      </w:r>
+      <w:r>
+        <w:rPr>
+          <w:b/>
+          <w:bCs/>
+        </w:rPr>
+        <w:t xml:space="preserve">pas besoin</w:t>
+      </w:r>
+      <w:r>
+        <w:t xml:space="preserve"> </w:t>
+      </w:r>
+      <w:r>
+        <w:t xml:space="preserve">de fermer puis rouvrir la fenêtre) ;</w:t>
+      </w:r>
+    </w:p>
+    <w:p>
+      <w:pPr>
+        <w:pStyle w:val="Compact"/>
+        <w:numPr>
+          <w:ilvl w:val="0"/>
+          <w:numId w:val="1002"/>
+        </w:numPr>
+      </w:pPr>
+      <w:r>
+        <w:t xml:space="preserve">le téléchargement du fichier</w:t>
+      </w:r>
+      <w:r>
+        <w:t xml:space="preserve"> </w:t>
+      </w:r>
+      <w:r>
+        <w:rPr>
+          <w:rStyle w:val="VerbatimChar"/>
+        </w:rPr>
+        <w:t xml:space="preserve">BiblioManager.jar</w:t>
+      </w:r>
+      <w:r>
+        <w:t xml:space="preserve"> </w:t>
+      </w:r>
+      <w:r>
+        <w:t xml:space="preserve">(environ 13 Mo) ;</w:t>
+      </w:r>
+    </w:p>
+    <w:p>
+      <w:pPr>
+        <w:pStyle w:val="Compact"/>
+        <w:numPr>
+          <w:ilvl w:val="0"/>
+          <w:numId w:val="1002"/>
+        </w:numPr>
+      </w:pPr>
+      <w:r>
+        <w:t xml:space="preserve">le lancement de l’application.</w:t>
+      </w:r>
+    </w:p>
+    <w:p>
+      <w:pPr>
+        <w:pStyle w:val="FirstParagraph"/>
+      </w:pPr>
+      <w:r>
+        <w:t xml:space="preserve">Aucune autre intervention n’est requise. La fenêtre principale s’ouvre dans les secondes qui suivent.</w:t>
+      </w:r>
+    </w:p>
+    <w:p>
+      <w:pPr>
+        <w:pStyle w:val="BlockText"/>
+      </w:pPr>
+      <w:r>
+        <w:rPr>
+          <w:b/>
+          <w:bCs/>
+        </w:rPr>
+        <w:t xml:space="preserve">Sécurité :</w:t>
+      </w:r>
+      <w:r>
+        <w:t xml:space="preserve"> </w:t>
+      </w:r>
+      <w:r>
+        <w:t xml:space="preserve">si vous souhaitez inspecter le script avant exécution, ouvrez l’URL</w:t>
+      </w:r>
+      <w:r>
+        <w:t xml:space="preserve"> </w:t>
+      </w:r>
+      <w:r>
+        <w:rPr>
+          <w:rStyle w:val="VerbatimChar"/>
+        </w:rPr>
+        <w:t xml:space="preserve">https://raw.githubusercontent.com/sbarhabazi/BiblioManager/main/install.ps1</w:t>
+      </w:r>
+      <w:r>
+        <w:t xml:space="preserve"> </w:t>
+      </w:r>
+      <w:r>
+        <w:t xml:space="preserve">dans votre navigateur. Le script complet (environ 80 lignes commentées en français) y est consultable.</w:t>
+      </w:r>
+    </w:p>
+    <w:bookmarkEnd w:id="14"/>
+    <w:bookmarkStart w:id="15" w:name="macos-linux-deux-commandes"/>
+    <w:p>
+      <w:pPr>
+        <w:pStyle w:val="Heading3"/>
+      </w:pPr>
+      <w:r>
+        <w:t xml:space="preserve">3.2 macOS / Linux — deux commandes</w:t>
+      </w:r>
+    </w:p>
+    <w:p>
+      <w:pPr>
+        <w:pStyle w:val="FirstParagraph"/>
+      </w:pPr>
+      <w:r>
         <w:t xml:space="preserve">Ouvrez un terminal et tapez :</w:t>
       </w:r>
     </w:p>
@@ -885,159 +1120,6 @@
           <w:rStyle w:val="VerbatimChar"/>
         </w:rPr>
         <w:t xml:space="preserve">java -jar BiblioManager.jar</w:t>
-      </w:r>
-    </w:p>
-    <w:bookmarkEnd w:id="14"/>
-    <w:bookmarkStart w:id="15" w:name="Xd6cebc73c9708a1aa27b2eb9e6c2318e61d8d06"/>
-    <w:p>
-      <w:pPr>
-        <w:pStyle w:val="Heading3"/>
-      </w:pPr>
-      <w:r>
-        <w:t xml:space="preserve">3.2 Windows (PowerShell ou invite de commandes)</w:t>
-      </w:r>
-    </w:p>
-    <w:p>
-      <w:pPr>
-        <w:pStyle w:val="FirstParagraph"/>
-      </w:pPr>
-      <w:r>
-        <w:t xml:space="preserve">Ouvrez</w:t>
-      </w:r>
-      <w:r>
-        <w:t xml:space="preserve"> </w:t>
-      </w:r>
-      <w:r>
-        <w:rPr>
-          <w:b/>
-          <w:bCs/>
-        </w:rPr>
-        <w:t xml:space="preserve">PowerShell</w:t>
-      </w:r>
-      <w:r>
-        <w:t xml:space="preserve"> </w:t>
-      </w:r>
-      <w:r>
-        <w:t xml:space="preserve">(touche Windows, taper « PowerShell », Entrée), puis tapez :</w:t>
-      </w:r>
-    </w:p>
-    <w:p>
-      <w:pPr>
-        <w:pStyle w:val="SourceCode"/>
-      </w:pPr>
-      <w:r>
-        <w:rPr>
-          <w:rStyle w:val="VerbatimChar"/>
-        </w:rPr>
-        <w:t xml:space="preserve">curl.exe -L -o BiblioManager.jar https://github.com/sbarhabazi/BiblioManager/releases/latest/download/BiblioManager.jar</w:t>
-      </w:r>
-      <w:r>
-        <w:br/>
-      </w:r>
-      <w:r>
-        <w:rPr>
-          <w:rStyle w:val="VerbatimChar"/>
-        </w:rPr>
-        <w:t xml:space="preserve">java -jar BiblioManager.jar</w:t>
-      </w:r>
-    </w:p>
-    <w:p>
-      <w:pPr>
-        <w:pStyle w:val="BlockText"/>
-      </w:pPr>
-      <w:r>
-        <w:rPr>
-          <w:b/>
-          <w:bCs/>
-        </w:rPr>
-        <w:t xml:space="preserve">Attention</w:t>
-      </w:r>
-      <w:r>
-        <w:t xml:space="preserve"> </w:t>
-      </w:r>
-      <w:r>
-        <w:t xml:space="preserve">: sous Windows, écrivez bien</w:t>
-      </w:r>
-      <w:r>
-        <w:t xml:space="preserve"> </w:t>
-      </w:r>
-      <w:r>
-        <w:rPr>
-          <w:rStyle w:val="VerbatimChar"/>
-        </w:rPr>
-        <w:t xml:space="preserve">curl.exe</w:t>
-      </w:r>
-      <w:r>
-        <w:t xml:space="preserve"> </w:t>
-      </w:r>
-      <w:r>
-        <w:t xml:space="preserve">(avec l’extension</w:t>
-      </w:r>
-      <w:r>
-        <w:t xml:space="preserve"> </w:t>
-      </w:r>
-      <w:r>
-        <w:rPr>
-          <w:rStyle w:val="VerbatimChar"/>
-        </w:rPr>
-        <w:t xml:space="preserve">.exe</w:t>
-      </w:r>
-      <w:r>
-        <w:t xml:space="preserve">). PowerShell définit en effet un alias</w:t>
-      </w:r>
-      <w:r>
-        <w:t xml:space="preserve"> </w:t>
-      </w:r>
-      <w:r>
-        <w:rPr>
-          <w:rStyle w:val="VerbatimChar"/>
-        </w:rPr>
-        <w:t xml:space="preserve">curl</w:t>
-      </w:r>
-      <w:r>
-        <w:t xml:space="preserve"> </w:t>
-      </w:r>
-      <w:r>
-        <w:t xml:space="preserve">qui pointe vers une commande différente (</w:t>
-      </w:r>
-      <w:r>
-        <w:rPr>
-          <w:rStyle w:val="VerbatimChar"/>
-        </w:rPr>
-        <w:t xml:space="preserve">Invoke-WebRequest</w:t>
-      </w:r>
-      <w:r>
-        <w:t xml:space="preserve">) qui n’accepte pas la même syntaxe. L’extension</w:t>
-      </w:r>
-      <w:r>
-        <w:t xml:space="preserve"> </w:t>
-      </w:r>
-      <w:r>
-        <w:rPr>
-          <w:rStyle w:val="VerbatimChar"/>
-        </w:rPr>
-        <w:t xml:space="preserve">.exe</w:t>
-      </w:r>
-      <w:r>
-        <w:t xml:space="preserve"> </w:t>
-      </w:r>
-      <w:r>
-        <w:t xml:space="preserve">force l’utilisation du véritable outil</w:t>
-      </w:r>
-      <w:r>
-        <w:t xml:space="preserve"> </w:t>
-      </w:r>
-      <w:r>
-        <w:rPr>
-          <w:rStyle w:val="VerbatimChar"/>
-        </w:rPr>
-        <w:t xml:space="preserve">curl</w:t>
-      </w:r>
-      <w:r>
-        <w:t xml:space="preserve"> </w:t>
-      </w:r>
-      <w:r>
-        <w:t xml:space="preserve">(présent par défaut sur Windows 10 et plus récent).</w:t>
       </w:r>
     </w:p>
     <w:bookmarkEnd w:id="15"/>
@@ -1117,7 +1199,7 @@
         <w:pStyle w:val="Compact"/>
         <w:numPr>
           <w:ilvl w:val="0"/>
-          <w:numId w:val="1002"/>
+          <w:numId w:val="1003"/>
         </w:numPr>
       </w:pPr>
       <w:r>
@@ -1131,36 +1213,7 @@
         <w:t xml:space="preserve"> </w:t>
       </w:r>
       <w:r>
-        <w:t xml:space="preserve">double-cliquez sur le fichier téléchargé. Si rien ne se passe, faites clic droit →</w:t>
-      </w:r>
-      <w:r>
-        <w:t xml:space="preserve"> </w:t>
-      </w:r>
-      <w:r>
-        <w:rPr>
-          <w:i/>
-          <w:iCs/>
-        </w:rPr>
-        <w:t xml:space="preserve">Ouvrir avec</w:t>
-      </w:r>
-      <w:r>
-        <w:t xml:space="preserve"> </w:t>
-      </w:r>
-      <w:r>
-        <w:t xml:space="preserve">→</w:t>
-      </w:r>
-      <w:r>
-        <w:t xml:space="preserve"> </w:t>
-      </w:r>
-      <w:r>
-        <w:rPr>
-          <w:i/>
-          <w:iCs/>
-        </w:rPr>
-        <w:t xml:space="preserve">Java(TM) Platform SE Binary</w:t>
-      </w:r>
-      <w:r>
-        <w:t xml:space="preserve">. Si l’option n’apparaît pas, ouvrez PowerShell dans le dossier de téléchargement (clic droit dans le dossier en maintenant</w:t>
+        <w:t xml:space="preserve">double-cliquez sur le fichier téléchargé. Si rien ne se passe, ouvrez PowerShell dans le dossier de téléchargement (clic droit dans le dossier en maintenant</w:t>
       </w:r>
       <w:r>
         <w:t xml:space="preserve"> </w:t>
@@ -1209,7 +1262,7 @@
         <w:pStyle w:val="Compact"/>
         <w:numPr>
           <w:ilvl w:val="0"/>
-          <w:numId w:val="1002"/>
+          <w:numId w:val="1003"/>
         </w:numPr>
       </w:pPr>
       <w:r>
@@ -1247,7 +1300,7 @@
         <w:pStyle w:val="Compact"/>
         <w:numPr>
           <w:ilvl w:val="0"/>
-          <w:numId w:val="1002"/>
+          <w:numId w:val="1003"/>
         </w:numPr>
       </w:pPr>
       <w:r>
@@ -1884,7 +1937,7 @@
         <w:pStyle w:val="Compact"/>
         <w:numPr>
           <w:ilvl w:val="0"/>
-          <w:numId w:val="1003"/>
+          <w:numId w:val="1004"/>
         </w:numPr>
       </w:pPr>
       <w:r>
@@ -1912,7 +1965,7 @@
         <w:pStyle w:val="Compact"/>
         <w:numPr>
           <w:ilvl w:val="0"/>
-          <w:numId w:val="1003"/>
+          <w:numId w:val="1004"/>
         </w:numPr>
       </w:pPr>
       <w:r>
@@ -1924,7 +1977,7 @@
         <w:pStyle w:val="Compact"/>
         <w:numPr>
           <w:ilvl w:val="1"/>
-          <w:numId w:val="1004"/>
+          <w:numId w:val="1005"/>
         </w:numPr>
       </w:pPr>
       <w:r>
@@ -1949,7 +2002,7 @@
         <w:pStyle w:val="Compact"/>
         <w:numPr>
           <w:ilvl w:val="1"/>
-          <w:numId w:val="1004"/>
+          <w:numId w:val="1005"/>
         </w:numPr>
       </w:pPr>
       <w:r>
@@ -1974,7 +2027,7 @@
         <w:pStyle w:val="Compact"/>
         <w:numPr>
           <w:ilvl w:val="1"/>
-          <w:numId w:val="1004"/>
+          <w:numId w:val="1005"/>
         </w:numPr>
       </w:pPr>
       <w:r>
@@ -1999,7 +2052,7 @@
         <w:pStyle w:val="Compact"/>
         <w:numPr>
           <w:ilvl w:val="1"/>
-          <w:numId w:val="1004"/>
+          <w:numId w:val="1005"/>
         </w:numPr>
       </w:pPr>
       <w:r>
@@ -2024,7 +2077,7 @@
         <w:pStyle w:val="Compact"/>
         <w:numPr>
           <w:ilvl w:val="1"/>
-          <w:numId w:val="1004"/>
+          <w:numId w:val="1005"/>
         </w:numPr>
       </w:pPr>
       <w:r>
@@ -2049,7 +2102,7 @@
         <w:pStyle w:val="Compact"/>
         <w:numPr>
           <w:ilvl w:val="0"/>
-          <w:numId w:val="1003"/>
+          <w:numId w:val="1004"/>
         </w:numPr>
       </w:pPr>
       <w:r>
@@ -2089,7 +2142,7 @@
         <w:pStyle w:val="Compact"/>
         <w:numPr>
           <w:ilvl w:val="0"/>
-          <w:numId w:val="1003"/>
+          <w:numId w:val="1004"/>
         </w:numPr>
       </w:pPr>
       <w:r>
@@ -2141,7 +2194,7 @@
         <w:pStyle w:val="Compact"/>
         <w:numPr>
           <w:ilvl w:val="0"/>
-          <w:numId w:val="1003"/>
+          <w:numId w:val="1004"/>
         </w:numPr>
       </w:pPr>
       <w:r>
@@ -2337,7 +2390,7 @@
         <w:pStyle w:val="Compact"/>
         <w:numPr>
           <w:ilvl w:val="0"/>
-          <w:numId w:val="1005"/>
+          <w:numId w:val="1006"/>
         </w:numPr>
       </w:pPr>
       <w:r>
@@ -2365,7 +2418,7 @@
         <w:pStyle w:val="Compact"/>
         <w:numPr>
           <w:ilvl w:val="0"/>
-          <w:numId w:val="1005"/>
+          <w:numId w:val="1006"/>
         </w:numPr>
       </w:pPr>
       <w:r>
@@ -2393,7 +2446,7 @@
         <w:pStyle w:val="Compact"/>
         <w:numPr>
           <w:ilvl w:val="0"/>
-          <w:numId w:val="1005"/>
+          <w:numId w:val="1006"/>
         </w:numPr>
       </w:pPr>
       <w:r>
@@ -2448,7 +2501,7 @@
         <w:pStyle w:val="Compact"/>
         <w:numPr>
           <w:ilvl w:val="0"/>
-          <w:numId w:val="1005"/>
+          <w:numId w:val="1006"/>
         </w:numPr>
       </w:pPr>
       <w:r>
@@ -2724,7 +2777,7 @@
         <w:pStyle w:val="Compact"/>
         <w:numPr>
           <w:ilvl w:val="0"/>
-          <w:numId w:val="1006"/>
+          <w:numId w:val="1007"/>
         </w:numPr>
       </w:pPr>
       <w:r>
@@ -2746,7 +2799,7 @@
         <w:pStyle w:val="Compact"/>
         <w:numPr>
           <w:ilvl w:val="0"/>
-          <w:numId w:val="1006"/>
+          <w:numId w:val="1007"/>
         </w:numPr>
       </w:pPr>
       <w:r>
@@ -3729,7 +3782,7 @@
         <w:pStyle w:val="Compact"/>
         <w:numPr>
           <w:ilvl w:val="0"/>
-          <w:numId w:val="1007"/>
+          <w:numId w:val="1008"/>
         </w:numPr>
       </w:pPr>
       <w:r>
@@ -3751,7 +3804,7 @@
         <w:pStyle w:val="Compact"/>
         <w:numPr>
           <w:ilvl w:val="0"/>
-          <w:numId w:val="1007"/>
+          <w:numId w:val="1008"/>
         </w:numPr>
       </w:pPr>
       <w:r>
@@ -3773,7 +3826,7 @@
         <w:pStyle w:val="Compact"/>
         <w:numPr>
           <w:ilvl w:val="0"/>
-          <w:numId w:val="1007"/>
+          <w:numId w:val="1008"/>
         </w:numPr>
       </w:pPr>
       <w:r>
@@ -3795,7 +3848,7 @@
         <w:pStyle w:val="Compact"/>
         <w:numPr>
           <w:ilvl w:val="0"/>
-          <w:numId w:val="1007"/>
+          <w:numId w:val="1008"/>
         </w:numPr>
       </w:pPr>
       <w:r>
@@ -4124,9 +4177,6 @@
     <w:abstractNumId w:val="991"/>
   </w:num>
   <w:num w:numId="1002">
-    <w:abstractNumId w:val="991"/>
-  </w:num>
-  <w:num w:numId="1003">
     <w:abstractNumId w:val="99411"/>
     <w:lvlOverride w:ilvl="0">
       <w:startOverride w:val="1"/>
@@ -4156,8 +4206,38 @@
       <w:startOverride w:val="1"/>
     </w:lvlOverride>
   </w:num>
+  <w:num w:numId="1003">
+    <w:abstractNumId w:val="991"/>
+  </w:num>
   <w:num w:numId="1004">
-    <w:abstractNumId w:val="991"/>
+    <w:abstractNumId w:val="99411"/>
+    <w:lvlOverride w:ilvl="0">
+      <w:startOverride w:val="1"/>
+    </w:lvlOverride>
+    <w:lvlOverride w:ilvl="1">
+      <w:startOverride w:val="1"/>
+    </w:lvlOverride>
+    <w:lvlOverride w:ilvl="2">
+      <w:startOverride w:val="1"/>
+    </w:lvlOverride>
+    <w:lvlOverride w:ilvl="3">
+      <w:startOverride w:val="1"/>
+    </w:lvlOverride>
+    <w:lvlOverride w:ilvl="4">
+      <w:startOverride w:val="1"/>
+    </w:lvlOverride>
+    <w:lvlOverride w:ilvl="5">
+      <w:startOverride w:val="1"/>
+    </w:lvlOverride>
+    <w:lvlOverride w:ilvl="6">
+      <w:startOverride w:val="1"/>
+    </w:lvlOverride>
+    <w:lvlOverride w:ilvl="7">
+      <w:startOverride w:val="1"/>
+    </w:lvlOverride>
+    <w:lvlOverride w:ilvl="8">
+      <w:startOverride w:val="1"/>
+    </w:lvlOverride>
   </w:num>
   <w:num w:numId="1005">
     <w:abstractNumId w:val="991"/>
@@ -4166,6 +4246,9 @@
     <w:abstractNumId w:val="991"/>
   </w:num>
   <w:num w:numId="1007">
+    <w:abstractNumId w:val="991"/>
+  </w:num>
+  <w:num w:numId="1008">
     <w:abstractNumId w:val="991"/>
   </w:num>
 </w:numbering>

</xml_diff>

<commit_message>
PDF : commande curl sur deux lignes (continuation \) + URL PowerShell raccourcie
Le PDF cassait l'URL au milieu lors du word-wrap, ce qui produisait
deux commandes invalides au copier-coller. Solutions :
- Mac/Linux : continuation '\' explicite — le shell joint les lignes
- Windows : URL raccourcie (github.com/.../raw au lieu de
  raw.githubusercontent.com), tient en une seule ligne (76 caracteres)
</commit_message>
<xml_diff>
--- a/docs/Guide-Utilisation.docx
+++ b/docs/Guide-Utilisation.docx
@@ -904,7 +904,7 @@
         <w:rPr>
           <w:rStyle w:val="VerbatimChar"/>
         </w:rPr>
-        <w:t xml:space="preserve">iex (irm https://raw.githubusercontent.com/sbarhabazi/BiblioManager/main/install.ps1)</w:t>
+        <w:t xml:space="preserve">iex (irm 'https://github.com/sbarhabazi/BiblioManager/raw/main/install.ps1')</w:t>
       </w:r>
     </w:p>
     <w:p>
@@ -1099,7 +1099,22 @@
         <w:pStyle w:val="FirstParagraph"/>
       </w:pPr>
       <w:r>
-        <w:t xml:space="preserve">Ouvrez un terminal et tapez :</w:t>
+        <w:t xml:space="preserve">Ouvrez un terminal et tapez (la barre oblique inversée</w:t>
+      </w:r>
+      <w:r>
+        <w:t xml:space="preserve"> </w:t>
+      </w:r>
+      <w:r>
+        <w:rPr>
+          <w:rStyle w:val="VerbatimChar"/>
+        </w:rPr>
+        <w:t xml:space="preserve">\</w:t>
+      </w:r>
+      <w:r>
+        <w:t xml:space="preserve"> </w:t>
+      </w:r>
+      <w:r>
+        <w:t xml:space="preserve">en fin de ligne permet au shell de joindre les deux lignes en une seule commande) :</w:t>
       </w:r>
     </w:p>
     <w:p>
@@ -1110,7 +1125,16 @@
         <w:rPr>
           <w:rStyle w:val="VerbatimChar"/>
         </w:rPr>
-        <w:t xml:space="preserve">curl -L -o BiblioManager.jar https://github.com/sbarhabazi/BiblioManager/releases/latest/download/BiblioManager.jar</w:t>
+        <w:t xml:space="preserve">curl -L -o BiblioManager.jar \</w:t>
+      </w:r>
+      <w:r>
+        <w:br/>
+      </w:r>
+      <w:r>
+        <w:rPr>
+          <w:rStyle w:val="VerbatimChar"/>
+        </w:rPr>
+        <w:t xml:space="preserve">  https://github.com/sbarhabazi/BiblioManager/releases/latest/download/BiblioManager.jar</w:t>
       </w:r>
       <w:r>
         <w:br/>

</xml_diff>